<commit_message>
docs: add v1.1 evidence — summary-only HITL preview fix verified
</commit_message>
<xml_diff>
--- a/docs/AIVerify_Gap_Analysis_v1_1.docx
+++ b/docs/AIVerify_Gap_Analysis_v1_1.docx
@@ -71,7 +71,29 @@
           <w:sz w:val="22"/>
           <w:szCs w:val="22"/>
         </w:rPr>
-        <w:t>28 March 2026  |  IMDA AI Verify Testing Framework (2025 Edition)  |  Updated from v0.9 baseline</w:t>
+        <w:t>2</w:t>
+      </w:r>
+      <w:r>
+        <w:rPr>
+          <w:rFonts w:eastAsia="Arial" w:cs="Arial"/>
+          <w:i/>
+          <w:iCs/>
+          <w:color w:val="666666"/>
+          <w:sz w:val="22"/>
+          <w:szCs w:val="22"/>
+        </w:rPr>
+        <w:t>7</w:t>
+      </w:r>
+      <w:r>
+        <w:rPr>
+          <w:rFonts w:eastAsia="Arial" w:cs="Arial"/>
+          <w:i/>
+          <w:iCs/>
+          <w:color w:val="666666"/>
+          <w:sz w:val="22"/>
+          <w:szCs w:val="22"/>
+        </w:rPr>
+        <w:t xml:space="preserve"> March 2026  |  IMDA AI Verify Testing Framework (2025 Edition)  |  Updated from v0.9 baseline</w:t>
       </w:r>
     </w:p>
     <w:p>

</xml_diff>